<commit_message>
Update legal documentation for non-disclosure agreements and design transmittals: Revised clauses in the NDA to clarify confidentiality terms, including conditions for disclosing information and obligations for the Receiving Party. Enhanced the Design Transmittal document to specify file access permissions and deletion timelines. Updated the Quotation Cover Sheet to include GST details. Added a new BOM for the VAYN Shoulder Actuator, detailing part specifications and sourcing information for improved clarity and guidance.
</commit_message>
<xml_diff>
--- a/legal/00-Before-you-send.docx
+++ b/legal/00-Before-you-send.docx
@@ -183,16 +183,7 @@
           <w:i w:val="0"/>
           <w:sz w:val="22"/>
         </w:rPr>
-        <w:t>4.</w:t>
-      </w:r>
-      <w:r>
-        <w:rPr>
-          <w:rFonts w:ascii="Times New Roman" w:hAnsi="Times New Roman" w:cs="Times New Roman" w:eastAsia="Times New Roman"/>
-          <w:b w:val="0"/>
-          <w:i w:val="0"/>
-          <w:sz w:val="22"/>
-        </w:rPr>
-        <w:t xml:space="preserve">  The city whose courts should hear a dispute. Delhi and Mumbai have commercial courts used to intellectual-property matters. Use the city your advocate recommends.</w:t>
+        <w:t>4.  The city of Avenue's registered office. Write that same city in clause 15.3. The agreement is made in that city, so those courts already have a connection with the company. Use another city only if your advocate confirms that a court there is already competent. Commercial courts sit in the districts, so the city does not have to be Delhi or Mumbai.</w:t>
       </w:r>
     </w:p>
     <w:p>
@@ -218,6 +209,22 @@
           <w:sz w:val="22"/>
         </w:rPr>
         <w:t xml:space="preserve">  Leave the vendor block blank until you know the legal name, address, and GSTIN of that shop. The name on the agreement should be the name that would appear on a later invoice.</w:t>
+      </w:r>
+    </w:p>
+    <w:p>
+      <w:pPr>
+        <w:spacing w:before="20" w:after="60" w:line="259" w:lineRule="auto"/>
+        <w:ind w:left="425" w:hanging="425"/>
+        <w:jc w:val="both"/>
+      </w:pPr>
+      <w:r>
+        <w:rPr>
+          <w:rFonts w:ascii="Times New Roman" w:hAnsi="Times New Roman" w:cs="Times New Roman" w:eastAsia="Times New Roman"/>
+          <w:b w:val="0"/>
+          <w:i w:val="0"/>
+          <w:sz w:val="22"/>
+        </w:rPr>
+        <w:t>6.  Who signs for the shop. For a company, a director, or a person named in a board resolution. For a partnership, a partner the partnership deed authorises. For a proprietorship, the proprietor, and the vendor name should be that person's name, carrying on business as the shop name.</w:t>
       </w:r>
     </w:p>
     <w:p>
@@ -295,16 +302,7 @@
           <w:i w:val="0"/>
           <w:sz w:val="22"/>
         </w:rPr>
-        <w:t>1.</w:t>
-      </w:r>
-      <w:r>
-        <w:rPr>
-          <w:rFonts w:ascii="Times New Roman" w:hAnsi="Times New Roman" w:cs="Times New Roman" w:eastAsia="Times New Roman"/>
-          <w:b w:val="0"/>
-          <w:i w:val="0"/>
-          <w:sz w:val="22"/>
-        </w:rPr>
-        <w:t xml:space="preserve">  Send only the non-disclosure agreement. Do not attach drawings, STEP files, photographs, or samples to that email.</w:t>
+        <w:t>1.  Send only the non-disclosure agreement. Do not attach drawings, STEP files, photographs, or samples to that email. Do not describe the part geometry, dimensions, or function on a call or in that email. The agreement covers disclosures made on or after the date of the last signature.</w:t>
       </w:r>
     </w:p>
     <w:p>
@@ -536,7 +534,7 @@
           <w:i w:val="0"/>
           <w:sz w:val="22"/>
         </w:rPr>
-        <w:t>If you do not place an order, the agreement requires deletion within the period in clause 9. Ask for the signed destruction certificate and file it.</w:t>
+        <w:t>If you do not place an order, the agreement requires deletion within the period in clause 9. If the shop never submits a quotation, that period is fifteen days after ninety days from the first disclosure. Ask for the signed destruction certificate and file it.</w:t>
       </w:r>
     </w:p>
     <w:p>

</xml_diff>